<commit_message>
submission: the final run, the fairness slice, and the report that cites them
Adds the 20 Sep evidence pair -- run_20260920 (80 tickets, with the
fairness breakdown) and demo_20260920 (the four demo tickets) -- and the
compiled capstone report that reads from them.

Evaluation and Governance frameworks pick up the numbers from the new run,
and Stage_3_Prompt_Library is filled from prompts/ and the Stage 2 PRD.

Co-Authored-By: Claude Opus 5 <noreply@anthropic.com>
</commit_message>
<xml_diff>
--- a/docs/Evaluation_Framework.docx
+++ b/docs/Evaluation_Framework.docx
@@ -8872,6 +8872,1933 @@
                 <w:b w:val="0"/>
               </w:rPr>
               <w:t>No segment reached the audit's minimum size.</w:t>
+            </w:r>
+          </w:p>
+        </w:tc>
+      </w:tr>
+    </w:tbl>
+    <w:p>
+      <w:pPr>
+        <w:pStyle w:val="Heading3"/>
+      </w:pPr>
+      <w:r>
+        <w:t>Results — 80-ticket validation run (paid OpenAI configuration)</w:t>
+      </w:r>
+    </w:p>
+    <w:p>
+      <w:r>
+        <w:t>Run harness-20260920T173736Z-8eee28c5 (2026-09-20 UTC), 80 tickets, code a288388. Drafting gpt-4o-mini; guardrails gpt-4o. Confidence threshold 0.85; guardrails on; model cache on (31 cached calls, 273 live), so 9 of the 80 tickets were partly replayed. Runs against the hidden evaluation set: 0. Cost of the run: $0.8033 (489,124 tokens in, 23,147 out); wall clock 6.8 minutes. This is the full validation set and supersedes the 10-ticket paid run above and the 15 September 80-ticket run cited in the Governance Framework.</w:t>
+      </w:r>
+    </w:p>
+    <w:tbl>
+      <w:tblPr>
+        <w:tblW w:type="auto" w:w="0"/>
+        <w:jc w:val="center"/>
+        <w:tblLayout w:type="fixed"/>
+        <w:tblLook w:firstColumn="1" w:firstRow="1" w:lastColumn="0" w:lastRow="0" w:noHBand="0" w:noVBand="1" w:val="04A0"/>
+      </w:tblPr>
+      <w:tblGrid>
+        <w:gridCol w:w="1608"/>
+        <w:gridCol w:w="1608"/>
+        <w:gridCol w:w="1608"/>
+        <w:gridCol w:w="1608"/>
+        <w:gridCol w:w="1608"/>
+        <w:gridCol w:w="1608"/>
+      </w:tblGrid>
+      <w:tr>
+        <w:tc>
+          <w:tcPr>
+            <w:tcW w:type="dxa" w:w="2304"/>
+            <w:shd w:val="clear" w:fill="E8660A"/>
+            <w:tcBorders>
+              <w:top w:val="single" w:sz="6" w:color="D9D9E0"/>
+              <w:left w:val="single" w:sz="6" w:color="D9D9E0"/>
+              <w:bottom w:val="single" w:sz="6" w:color="D9D9E0"/>
+              <w:right w:val="single" w:sz="6" w:color="D9D9E0"/>
+            </w:tcBorders>
+          </w:tcPr>
+          <w:p>
+            <w:pPr>
+              <w:spacing w:before="60" w:after="60"/>
+            </w:pPr>
+            <w:r>
+              <w:rPr>
+                <w:b/>
+                <w:color w:val="FFFFFF"/>
+                <w:sz w:val="16"/>
+              </w:rPr>
+              <w:t>Measure</w:t>
+            </w:r>
+          </w:p>
+        </w:tc>
+        <w:tc>
+          <w:tcPr>
+            <w:tcW w:type="dxa" w:w="1296"/>
+            <w:shd w:val="clear" w:fill="E8660A"/>
+            <w:tcBorders>
+              <w:top w:val="single" w:sz="6" w:color="D9D9E0"/>
+              <w:left w:val="single" w:sz="6" w:color="D9D9E0"/>
+              <w:bottom w:val="single" w:sz="6" w:color="D9D9E0"/>
+              <w:right w:val="single" w:sz="6" w:color="D9D9E0"/>
+            </w:tcBorders>
+          </w:tcPr>
+          <w:p>
+            <w:pPr>
+              <w:spacing w:before="60" w:after="60"/>
+            </w:pPr>
+            <w:r>
+              <w:rPr>
+                <w:b/>
+                <w:color w:val="FFFFFF"/>
+                <w:sz w:val="16"/>
+              </w:rPr>
+              <w:t>Baseline</w:t>
+            </w:r>
+          </w:p>
+        </w:tc>
+        <w:tc>
+          <w:tcPr>
+            <w:tcW w:type="dxa" w:w="1080"/>
+            <w:shd w:val="clear" w:fill="E8660A"/>
+            <w:tcBorders>
+              <w:top w:val="single" w:sz="6" w:color="D9D9E0"/>
+              <w:left w:val="single" w:sz="6" w:color="D9D9E0"/>
+              <w:bottom w:val="single" w:sz="6" w:color="D9D9E0"/>
+              <w:right w:val="single" w:sz="6" w:color="D9D9E0"/>
+            </w:tcBorders>
+          </w:tcPr>
+          <w:p>
+            <w:pPr>
+              <w:spacing w:before="60" w:after="60"/>
+            </w:pPr>
+            <w:r>
+              <w:rPr>
+                <w:b/>
+                <w:color w:val="FFFFFF"/>
+                <w:sz w:val="16"/>
+              </w:rPr>
+              <w:t>Target</w:t>
+            </w:r>
+          </w:p>
+        </w:tc>
+        <w:tc>
+          <w:tcPr>
+            <w:tcW w:type="dxa" w:w="1080"/>
+            <w:shd w:val="clear" w:fill="E8660A"/>
+            <w:tcBorders>
+              <w:top w:val="single" w:sz="6" w:color="D9D9E0"/>
+              <w:left w:val="single" w:sz="6" w:color="D9D9E0"/>
+              <w:bottom w:val="single" w:sz="6" w:color="D9D9E0"/>
+              <w:right w:val="single" w:sz="6" w:color="D9D9E0"/>
+            </w:tcBorders>
+          </w:tcPr>
+          <w:p>
+            <w:pPr>
+              <w:spacing w:before="60" w:after="60"/>
+            </w:pPr>
+            <w:r>
+              <w:rPr>
+                <w:b/>
+                <w:color w:val="FFFFFF"/>
+                <w:sz w:val="16"/>
+              </w:rPr>
+              <w:t>Achieved</w:t>
+            </w:r>
+          </w:p>
+        </w:tc>
+        <w:tc>
+          <w:tcPr>
+            <w:tcW w:type="dxa" w:w="1728"/>
+            <w:shd w:val="clear" w:fill="E8660A"/>
+            <w:tcBorders>
+              <w:top w:val="single" w:sz="6" w:color="D9D9E0"/>
+              <w:left w:val="single" w:sz="6" w:color="D9D9E0"/>
+              <w:bottom w:val="single" w:sz="6" w:color="D9D9E0"/>
+              <w:right w:val="single" w:sz="6" w:color="D9D9E0"/>
+            </w:tcBorders>
+          </w:tcPr>
+          <w:p>
+            <w:pPr>
+              <w:spacing w:before="60" w:after="60"/>
+            </w:pPr>
+            <w:r>
+              <w:rPr>
+                <w:b/>
+                <w:color w:val="FFFFFF"/>
+                <w:sz w:val="16"/>
+              </w:rPr>
+              <w:t>Confidence in the figure</w:t>
+            </w:r>
+          </w:p>
+        </w:tc>
+        <w:tc>
+          <w:tcPr>
+            <w:tcW w:type="dxa" w:w="2160"/>
+            <w:shd w:val="clear" w:fill="E8660A"/>
+            <w:tcBorders>
+              <w:top w:val="single" w:sz="6" w:color="D9D9E0"/>
+              <w:left w:val="single" w:sz="6" w:color="D9D9E0"/>
+              <w:bottom w:val="single" w:sz="6" w:color="D9D9E0"/>
+              <w:right w:val="single" w:sz="6" w:color="D9D9E0"/>
+            </w:tcBorders>
+          </w:tcPr>
+          <w:p>
+            <w:pPr>
+              <w:spacing w:before="60" w:after="60"/>
+            </w:pPr>
+            <w:r>
+              <w:rPr>
+                <w:b/>
+                <w:color w:val="FFFFFF"/>
+                <w:sz w:val="16"/>
+              </w:rPr>
+              <w:t>Notes</w:t>
+            </w:r>
+          </w:p>
+        </w:tc>
+      </w:tr>
+      <w:tr>
+        <w:tc>
+          <w:tcPr>
+            <w:tcW w:type="dxa" w:w="2304"/>
+            <w:tcBorders>
+              <w:top w:val="single" w:sz="6" w:color="D9D9E0"/>
+              <w:left w:val="single" w:sz="6" w:color="D9D9E0"/>
+              <w:bottom w:val="single" w:sz="6" w:color="D9D9E0"/>
+              <w:right w:val="single" w:sz="6" w:color="D9D9E0"/>
+            </w:tcBorders>
+          </w:tcPr>
+          <w:p>
+            <w:pPr>
+              <w:spacing w:before="50" w:after="50"/>
+            </w:pPr>
+            <w:r>
+              <w:rPr>
+                <w:sz w:val="15"/>
+              </w:rPr>
+              <w:t>First contact resolution</w:t>
+            </w:r>
+          </w:p>
+        </w:tc>
+        <w:tc>
+          <w:tcPr>
+            <w:tcW w:type="dxa" w:w="1296"/>
+            <w:tcBorders>
+              <w:top w:val="single" w:sz="6" w:color="D9D9E0"/>
+              <w:left w:val="single" w:sz="6" w:color="D9D9E0"/>
+              <w:bottom w:val="single" w:sz="6" w:color="D9D9E0"/>
+              <w:right w:val="single" w:sz="6" w:color="D9D9E0"/>
+            </w:tcBorders>
+          </w:tcPr>
+          <w:p>
+            <w:pPr>
+              <w:spacing w:before="50" w:after="50"/>
+            </w:pPr>
+            <w:r>
+              <w:rPr>
+                <w:sz w:val="15"/>
+              </w:rPr>
+              <w:t>42%</w:t>
+            </w:r>
+          </w:p>
+        </w:tc>
+        <w:tc>
+          <w:tcPr>
+            <w:tcW w:type="dxa" w:w="1080"/>
+            <w:tcBorders>
+              <w:top w:val="single" w:sz="6" w:color="D9D9E0"/>
+              <w:left w:val="single" w:sz="6" w:color="D9D9E0"/>
+              <w:bottom w:val="single" w:sz="6" w:color="D9D9E0"/>
+              <w:right w:val="single" w:sz="6" w:color="D9D9E0"/>
+            </w:tcBorders>
+          </w:tcPr>
+          <w:p>
+            <w:pPr>
+              <w:spacing w:before="50" w:after="50"/>
+            </w:pPr>
+            <w:r>
+              <w:rPr>
+                <w:sz w:val="15"/>
+              </w:rPr>
+              <w:t>60%</w:t>
+            </w:r>
+          </w:p>
+        </w:tc>
+        <w:tc>
+          <w:tcPr>
+            <w:tcW w:type="dxa" w:w="1080"/>
+            <w:tcBorders>
+              <w:top w:val="single" w:sz="6" w:color="D9D9E0"/>
+              <w:left w:val="single" w:sz="6" w:color="D9D9E0"/>
+              <w:bottom w:val="single" w:sz="6" w:color="D9D9E0"/>
+              <w:right w:val="single" w:sz="6" w:color="D9D9E0"/>
+            </w:tcBorders>
+          </w:tcPr>
+          <w:p>
+            <w:pPr>
+              <w:spacing w:before="50" w:after="50"/>
+            </w:pPr>
+            <w:r>
+              <w:rPr>
+                <w:b/>
+              </w:rPr>
+              <w:t>43.8% correctly resolved (60.0% auto-sent) — NOT MET</w:t>
+            </w:r>
+          </w:p>
+        </w:tc>
+        <w:tc>
+          <w:tcPr>
+            <w:tcW w:type="dxa" w:w="1728"/>
+            <w:tcBorders>
+              <w:top w:val="single" w:sz="6" w:color="D9D9E0"/>
+              <w:left w:val="single" w:sz="6" w:color="D9D9E0"/>
+              <w:bottom w:val="single" w:sz="6" w:color="D9D9E0"/>
+              <w:right w:val="single" w:sz="6" w:color="D9D9E0"/>
+            </w:tcBorders>
+          </w:tcPr>
+          <w:p>
+            <w:pPr>
+              <w:spacing w:before="50" w:after="50"/>
+            </w:pPr>
+            <w:r>
+              <w:rPr>
+                <w:b w:val="0"/>
+              </w:rPr>
+              <w:t>95% CI 33-55% (n=80)</w:t>
+            </w:r>
+          </w:p>
+        </w:tc>
+        <w:tc>
+          <w:tcPr>
+            <w:tcW w:type="dxa" w:w="2160"/>
+            <w:tcBorders>
+              <w:top w:val="single" w:sz="6" w:color="D9D9E0"/>
+              <w:left w:val="single" w:sz="6" w:color="D9D9E0"/>
+              <w:bottom w:val="single" w:sz="6" w:color="D9D9E0"/>
+              <w:right w:val="single" w:sz="6" w:color="D9D9E0"/>
+            </w:tcBorders>
+          </w:tcPr>
+          <w:p>
+            <w:pPr>
+              <w:spacing w:before="50" w:after="50"/>
+            </w:pPr>
+            <w:r>
+              <w:rPr>
+                <w:b w:val="0"/>
+              </w:rPr>
+              <w:t>13 of 48 sent replies went to tickets the labels say must be held, so they are not counted as resolved: a wrong answer returns as a repeat contact. Correctness is agreement with labels.expected_route, not a check of reply quality.</w:t>
+            </w:r>
+          </w:p>
+        </w:tc>
+      </w:tr>
+      <w:tr>
+        <w:tc>
+          <w:tcPr>
+            <w:tcW w:type="dxa" w:w="2304"/>
+            <w:tcBorders>
+              <w:top w:val="single" w:sz="6" w:color="D9D9E0"/>
+              <w:left w:val="single" w:sz="6" w:color="D9D9E0"/>
+              <w:bottom w:val="single" w:sz="6" w:color="D9D9E0"/>
+              <w:right w:val="single" w:sz="6" w:color="D9D9E0"/>
+            </w:tcBorders>
+            <w:shd w:val="clear" w:fill="F4F4F7"/>
+          </w:tcPr>
+          <w:p>
+            <w:pPr>
+              <w:spacing w:before="50" w:after="50"/>
+            </w:pPr>
+            <w:r>
+              <w:rPr>
+                <w:sz w:val="15"/>
+              </w:rPr>
+              <w:t>Mean time to first reply</w:t>
+            </w:r>
+          </w:p>
+        </w:tc>
+        <w:tc>
+          <w:tcPr>
+            <w:tcW w:type="dxa" w:w="1296"/>
+            <w:tcBorders>
+              <w:top w:val="single" w:sz="6" w:color="D9D9E0"/>
+              <w:left w:val="single" w:sz="6" w:color="D9D9E0"/>
+              <w:bottom w:val="single" w:sz="6" w:color="D9D9E0"/>
+              <w:right w:val="single" w:sz="6" w:color="D9D9E0"/>
+            </w:tcBorders>
+            <w:shd w:val="clear" w:fill="F4F4F7"/>
+          </w:tcPr>
+          <w:p>
+            <w:pPr>
+              <w:spacing w:before="50" w:after="50"/>
+            </w:pPr>
+            <w:r>
+              <w:rPr>
+                <w:sz w:val="15"/>
+              </w:rPr>
+              <w:t>8 to 12 hrs</w:t>
+            </w:r>
+          </w:p>
+        </w:tc>
+        <w:tc>
+          <w:tcPr>
+            <w:tcW w:type="dxa" w:w="1080"/>
+            <w:tcBorders>
+              <w:top w:val="single" w:sz="6" w:color="D9D9E0"/>
+              <w:left w:val="single" w:sz="6" w:color="D9D9E0"/>
+              <w:bottom w:val="single" w:sz="6" w:color="D9D9E0"/>
+              <w:right w:val="single" w:sz="6" w:color="D9D9E0"/>
+            </w:tcBorders>
+            <w:shd w:val="clear" w:fill="F4F4F7"/>
+          </w:tcPr>
+          <w:p>
+            <w:pPr>
+              <w:spacing w:before="50" w:after="50"/>
+            </w:pPr>
+            <w:r>
+              <w:rPr>
+                <w:sz w:val="15"/>
+              </w:rPr>
+              <w:t>&lt; 5 min</w:t>
+            </w:r>
+          </w:p>
+        </w:tc>
+        <w:tc>
+          <w:tcPr>
+            <w:tcW w:type="dxa" w:w="1080"/>
+            <w:tcBorders>
+              <w:top w:val="single" w:sz="6" w:color="D9D9E0"/>
+              <w:left w:val="single" w:sz="6" w:color="D9D9E0"/>
+              <w:bottom w:val="single" w:sz="6" w:color="D9D9E0"/>
+              <w:right w:val="single" w:sz="6" w:color="D9D9E0"/>
+            </w:tcBorders>
+            <w:shd w:val="clear" w:fill="F4F4F7"/>
+          </w:tcPr>
+          <w:p>
+            <w:pPr>
+              <w:spacing w:before="50" w:after="50"/>
+            </w:pPr>
+            <w:r>
+              <w:rPr>
+                <w:b/>
+              </w:rPr>
+              <w:t>5.3 s — MET</w:t>
+            </w:r>
+          </w:p>
+        </w:tc>
+        <w:tc>
+          <w:tcPr>
+            <w:tcW w:type="dxa" w:w="1728"/>
+            <w:tcBorders>
+              <w:top w:val="single" w:sz="6" w:color="D9D9E0"/>
+              <w:left w:val="single" w:sz="6" w:color="D9D9E0"/>
+              <w:bottom w:val="single" w:sz="6" w:color="D9D9E0"/>
+              <w:right w:val="single" w:sz="6" w:color="D9D9E0"/>
+            </w:tcBorders>
+            <w:shd w:val="clear" w:fill="F4F4F7"/>
+          </w:tcPr>
+          <w:p>
+            <w:pPr>
+              <w:spacing w:before="50" w:after="50"/>
+            </w:pPr>
+            <w:r>
+              <w:rPr>
+                <w:b w:val="0"/>
+              </w:rPr>
+              <w:t>n=48 auto-sent tickets; median 5.8 s; 7 partly replayed from the model cache (faster than live)</w:t>
+            </w:r>
+          </w:p>
+        </w:tc>
+        <w:tc>
+          <w:tcPr>
+            <w:tcW w:type="dxa" w:w="2160"/>
+            <w:tcBorders>
+              <w:top w:val="single" w:sz="6" w:color="D9D9E0"/>
+              <w:left w:val="single" w:sz="6" w:color="D9D9E0"/>
+              <w:bottom w:val="single" w:sz="6" w:color="D9D9E0"/>
+              <w:right w:val="single" w:sz="6" w:color="D9D9E0"/>
+            </w:tcBorders>
+            <w:shd w:val="clear" w:fill="F4F4F7"/>
+          </w:tcPr>
+          <w:p>
+            <w:pPr>
+              <w:spacing w:before="50" w:after="50"/>
+            </w:pPr>
+            <w:r>
+              <w:rPr>
+                <w:b w:val="0"/>
+              </w:rPr>
+              <w:t>Harness time from ticket read to reply ready; excludes queueing and delivery. The 32 escalated or blocked tickets get no automated reply (holding reply is out of scope, PRD Table 6), so their first reply comes from the human queue.</w:t>
+            </w:r>
+          </w:p>
+        </w:tc>
+      </w:tr>
+      <w:tr>
+        <w:tc>
+          <w:tcPr>
+            <w:tcW w:type="dxa" w:w="2304"/>
+            <w:tcBorders>
+              <w:top w:val="single" w:sz="6" w:color="D9D9E0"/>
+              <w:left w:val="single" w:sz="6" w:color="D9D9E0"/>
+              <w:bottom w:val="single" w:sz="6" w:color="D9D9E0"/>
+              <w:right w:val="single" w:sz="6" w:color="D9D9E0"/>
+            </w:tcBorders>
+          </w:tcPr>
+          <w:p>
+            <w:pPr>
+              <w:spacing w:before="50" w:after="50"/>
+            </w:pPr>
+            <w:r>
+              <w:rPr>
+                <w:sz w:val="15"/>
+              </w:rPr>
+              <w:t>Satisfaction proxy</w:t>
+            </w:r>
+          </w:p>
+        </w:tc>
+        <w:tc>
+          <w:tcPr>
+            <w:tcW w:type="dxa" w:w="1296"/>
+            <w:tcBorders>
+              <w:top w:val="single" w:sz="6" w:color="D9D9E0"/>
+              <w:left w:val="single" w:sz="6" w:color="D9D9E0"/>
+              <w:bottom w:val="single" w:sz="6" w:color="D9D9E0"/>
+              <w:right w:val="single" w:sz="6" w:color="D9D9E0"/>
+            </w:tcBorders>
+          </w:tcPr>
+          <w:p>
+            <w:pPr>
+              <w:spacing w:before="50" w:after="50"/>
+            </w:pPr>
+            <w:r>
+              <w:rPr>
+                <w:sz w:val="15"/>
+              </w:rPr>
+              <w:t>3.2 / 5</w:t>
+            </w:r>
+          </w:p>
+        </w:tc>
+        <w:tc>
+          <w:tcPr>
+            <w:tcW w:type="dxa" w:w="1080"/>
+            <w:tcBorders>
+              <w:top w:val="single" w:sz="6" w:color="D9D9E0"/>
+              <w:left w:val="single" w:sz="6" w:color="D9D9E0"/>
+              <w:bottom w:val="single" w:sz="6" w:color="D9D9E0"/>
+              <w:right w:val="single" w:sz="6" w:color="D9D9E0"/>
+            </w:tcBorders>
+          </w:tcPr>
+          <w:p>
+            <w:pPr>
+              <w:spacing w:before="50" w:after="50"/>
+            </w:pPr>
+            <w:r>
+              <w:rPr>
+                <w:sz w:val="15"/>
+              </w:rPr>
+              <w:t>4.0</w:t>
+            </w:r>
+          </w:p>
+        </w:tc>
+        <w:tc>
+          <w:tcPr>
+            <w:tcW w:type="dxa" w:w="1080"/>
+            <w:tcBorders>
+              <w:top w:val="single" w:sz="6" w:color="D9D9E0"/>
+              <w:left w:val="single" w:sz="6" w:color="D9D9E0"/>
+              <w:bottom w:val="single" w:sz="6" w:color="D9D9E0"/>
+              <w:right w:val="single" w:sz="6" w:color="D9D9E0"/>
+            </w:tcBorders>
+          </w:tcPr>
+          <w:p>
+            <w:pPr>
+              <w:spacing w:before="50" w:after="50"/>
+            </w:pPr>
+            <w:r>
+              <w:rPr>
+                <w:b/>
+              </w:rPr>
+              <w:t>Not measured — NOT MEASURED</w:t>
+            </w:r>
+          </w:p>
+        </w:tc>
+        <w:tc>
+          <w:tcPr>
+            <w:tcW w:type="dxa" w:w="1728"/>
+            <w:tcBorders>
+              <w:top w:val="single" w:sz="6" w:color="D9D9E0"/>
+              <w:left w:val="single" w:sz="6" w:color="D9D9E0"/>
+              <w:bottom w:val="single" w:sz="6" w:color="D9D9E0"/>
+              <w:right w:val="single" w:sz="6" w:color="D9D9E0"/>
+            </w:tcBorders>
+          </w:tcPr>
+          <w:p>
+            <w:pPr>
+              <w:spacing w:before="50" w:after="50"/>
+            </w:pPr>
+            <w:r>
+              <w:rPr>
+                <w:b w:val="0"/>
+              </w:rPr>
+              <w:t>No scored sample on this run</w:t>
+            </w:r>
+          </w:p>
+        </w:tc>
+        <w:tc>
+          <w:tcPr>
+            <w:tcW w:type="dxa" w:w="2160"/>
+            <w:tcBorders>
+              <w:top w:val="single" w:sz="6" w:color="D9D9E0"/>
+              <w:left w:val="single" w:sz="6" w:color="D9D9E0"/>
+              <w:bottom w:val="single" w:sz="6" w:color="D9D9E0"/>
+              <w:right w:val="single" w:sz="6" w:color="D9D9E0"/>
+            </w:tcBorders>
+          </w:tcPr>
+          <w:p>
+            <w:pPr>
+              <w:spacing w:before="50" w:after="50"/>
+            </w:pPr>
+            <w:r>
+              <w:rPr>
+                <w:b w:val="0"/>
+              </w:rPr>
+              <w:t>The Framework's method is human review of a stated sample of responses against a rubric, reporting sample size, rubric and scorers. Not done for this run. Nearest evidence: B-18, where one person scored 50 drafts from b21_openai_80_20260914 on the judge's RAG rubric (mean answer relevance 4.86/5) — a different rubric, a different run and a single scorer, so not a satisfaction proxy.</w:t>
+            </w:r>
+          </w:p>
+        </w:tc>
+      </w:tr>
+      <w:tr>
+        <w:tc>
+          <w:tcPr>
+            <w:tcW w:type="dxa" w:w="2304"/>
+            <w:tcBorders>
+              <w:top w:val="single" w:sz="6" w:color="D9D9E0"/>
+              <w:left w:val="single" w:sz="6" w:color="D9D9E0"/>
+              <w:bottom w:val="single" w:sz="6" w:color="D9D9E0"/>
+              <w:right w:val="single" w:sz="6" w:color="D9D9E0"/>
+            </w:tcBorders>
+            <w:shd w:val="clear" w:fill="F4F4F7"/>
+          </w:tcPr>
+          <w:p>
+            <w:pPr>
+              <w:spacing w:before="50" w:after="50"/>
+            </w:pPr>
+            <w:r>
+              <w:rPr>
+                <w:sz w:val="15"/>
+              </w:rPr>
+              <w:t>Escalation rate</w:t>
+            </w:r>
+          </w:p>
+        </w:tc>
+        <w:tc>
+          <w:tcPr>
+            <w:tcW w:type="dxa" w:w="1296"/>
+            <w:tcBorders>
+              <w:top w:val="single" w:sz="6" w:color="D9D9E0"/>
+              <w:left w:val="single" w:sz="6" w:color="D9D9E0"/>
+              <w:bottom w:val="single" w:sz="6" w:color="D9D9E0"/>
+              <w:right w:val="single" w:sz="6" w:color="D9D9E0"/>
+            </w:tcBorders>
+            <w:shd w:val="clear" w:fill="F4F4F7"/>
+          </w:tcPr>
+          <w:p>
+            <w:pPr>
+              <w:spacing w:before="50" w:after="50"/>
+            </w:pPr>
+            <w:r>
+              <w:rPr>
+                <w:sz w:val="15"/>
+              </w:rPr>
+              <w:t>58%</w:t>
+            </w:r>
+          </w:p>
+        </w:tc>
+        <w:tc>
+          <w:tcPr>
+            <w:tcW w:type="dxa" w:w="1080"/>
+            <w:tcBorders>
+              <w:top w:val="single" w:sz="6" w:color="D9D9E0"/>
+              <w:left w:val="single" w:sz="6" w:color="D9D9E0"/>
+              <w:bottom w:val="single" w:sz="6" w:color="D9D9E0"/>
+              <w:right w:val="single" w:sz="6" w:color="D9D9E0"/>
+            </w:tcBorders>
+            <w:shd w:val="clear" w:fill="F4F4F7"/>
+          </w:tcPr>
+          <w:p>
+            <w:pPr>
+              <w:spacing w:before="50" w:after="50"/>
+            </w:pPr>
+            <w:r>
+              <w:rPr>
+                <w:sz w:val="15"/>
+              </w:rPr>
+              <w:t>≤ 30%</w:t>
+            </w:r>
+          </w:p>
+        </w:tc>
+        <w:tc>
+          <w:tcPr>
+            <w:tcW w:type="dxa" w:w="1080"/>
+            <w:tcBorders>
+              <w:top w:val="single" w:sz="6" w:color="D9D9E0"/>
+              <w:left w:val="single" w:sz="6" w:color="D9D9E0"/>
+              <w:bottom w:val="single" w:sz="6" w:color="D9D9E0"/>
+              <w:right w:val="single" w:sz="6" w:color="D9D9E0"/>
+            </w:tcBorders>
+            <w:shd w:val="clear" w:fill="F4F4F7"/>
+          </w:tcPr>
+          <w:p>
+            <w:pPr>
+              <w:spacing w:before="50" w:after="50"/>
+            </w:pPr>
+            <w:r>
+              <w:rPr>
+                <w:b/>
+              </w:rPr>
+              <w:t>40.0% — NOT MET</w:t>
+            </w:r>
+          </w:p>
+        </w:tc>
+        <w:tc>
+          <w:tcPr>
+            <w:tcW w:type="dxa" w:w="1728"/>
+            <w:tcBorders>
+              <w:top w:val="single" w:sz="6" w:color="D9D9E0"/>
+              <w:left w:val="single" w:sz="6" w:color="D9D9E0"/>
+              <w:bottom w:val="single" w:sz="6" w:color="D9D9E0"/>
+              <w:right w:val="single" w:sz="6" w:color="D9D9E0"/>
+            </w:tcBorders>
+            <w:shd w:val="clear" w:fill="F4F4F7"/>
+          </w:tcPr>
+          <w:p>
+            <w:pPr>
+              <w:spacing w:before="50" w:after="50"/>
+            </w:pPr>
+            <w:r>
+              <w:rPr>
+                <w:b w:val="0"/>
+              </w:rPr>
+              <w:t>95% CI 30-51% (n=80)</w:t>
+            </w:r>
+          </w:p>
+        </w:tc>
+        <w:tc>
+          <w:tcPr>
+            <w:tcW w:type="dxa" w:w="2160"/>
+            <w:tcBorders>
+              <w:top w:val="single" w:sz="6" w:color="D9D9E0"/>
+              <w:left w:val="single" w:sz="6" w:color="D9D9E0"/>
+              <w:bottom w:val="single" w:sz="6" w:color="D9D9E0"/>
+              <w:right w:val="single" w:sz="6" w:color="D9D9E0"/>
+            </w:tcBorders>
+            <w:shd w:val="clear" w:fill="F4F4F7"/>
+          </w:tcPr>
+          <w:p>
+            <w:pPr>
+              <w:spacing w:before="50" w:after="50"/>
+            </w:pPr>
+            <w:r>
+              <w:rPr>
+                <w:b w:val="0"/>
+              </w:rPr>
+              <w:t>24 escalated by routing and 8 blocked by a guardrail; 0 tickets were blocked because a check could not run (fail-safe), not because it found a fault.</w:t>
+            </w:r>
+          </w:p>
+        </w:tc>
+      </w:tr>
+      <w:tr>
+        <w:tc>
+          <w:tcPr>
+            <w:tcW w:type="dxa" w:w="2304"/>
+            <w:tcBorders>
+              <w:top w:val="single" w:sz="6" w:color="D9D9E0"/>
+              <w:left w:val="single" w:sz="6" w:color="D9D9E0"/>
+              <w:bottom w:val="single" w:sz="6" w:color="D9D9E0"/>
+              <w:right w:val="single" w:sz="6" w:color="D9D9E0"/>
+            </w:tcBorders>
+          </w:tcPr>
+          <w:p>
+            <w:pPr>
+              <w:spacing w:before="50" w:after="50"/>
+            </w:pPr>
+            <w:r>
+              <w:rPr>
+                <w:sz w:val="15"/>
+              </w:rPr>
+              <w:t>Classification precision</w:t>
+            </w:r>
+          </w:p>
+        </w:tc>
+        <w:tc>
+          <w:tcPr>
+            <w:tcW w:type="dxa" w:w="1296"/>
+            <w:tcBorders>
+              <w:top w:val="single" w:sz="6" w:color="D9D9E0"/>
+              <w:left w:val="single" w:sz="6" w:color="D9D9E0"/>
+              <w:bottom w:val="single" w:sz="6" w:color="D9D9E0"/>
+              <w:right w:val="single" w:sz="6" w:color="D9D9E0"/>
+            </w:tcBorders>
+          </w:tcPr>
+          <w:p>
+            <w:pPr>
+              <w:spacing w:before="50" w:after="50"/>
+            </w:pPr>
+            <w:r>
+              <w:rPr>
+                <w:sz w:val="15"/>
+              </w:rPr>
+              <w:t>—</w:t>
+            </w:r>
+          </w:p>
+        </w:tc>
+        <w:tc>
+          <w:tcPr>
+            <w:tcW w:type="dxa" w:w="1080"/>
+            <w:tcBorders>
+              <w:top w:val="single" w:sz="6" w:color="D9D9E0"/>
+              <w:left w:val="single" w:sz="6" w:color="D9D9E0"/>
+              <w:bottom w:val="single" w:sz="6" w:color="D9D9E0"/>
+              <w:right w:val="single" w:sz="6" w:color="D9D9E0"/>
+            </w:tcBorders>
+          </w:tcPr>
+          <w:p>
+            <w:pPr>
+              <w:spacing w:before="50" w:after="50"/>
+            </w:pPr>
+            <w:r>
+              <w:rPr>
+                <w:sz w:val="15"/>
+              </w:rPr>
+              <w:t>85%</w:t>
+            </w:r>
+          </w:p>
+        </w:tc>
+        <w:tc>
+          <w:tcPr>
+            <w:tcW w:type="dxa" w:w="1080"/>
+            <w:tcBorders>
+              <w:top w:val="single" w:sz="6" w:color="D9D9E0"/>
+              <w:left w:val="single" w:sz="6" w:color="D9D9E0"/>
+              <w:bottom w:val="single" w:sz="6" w:color="D9D9E0"/>
+              <w:right w:val="single" w:sz="6" w:color="D9D9E0"/>
+            </w:tcBorders>
+          </w:tcPr>
+          <w:p>
+            <w:pPr>
+              <w:spacing w:before="50" w:after="50"/>
+            </w:pPr>
+            <w:r>
+              <w:rPr>
+                <w:b/>
+              </w:rPr>
+              <w:t>82.0% mean over 22 classes; 15 of 22 at ≥85% — NOT MET</w:t>
+            </w:r>
+          </w:p>
+        </w:tc>
+        <w:tc>
+          <w:tcPr>
+            <w:tcW w:type="dxa" w:w="1728"/>
+            <w:tcBorders>
+              <w:top w:val="single" w:sz="6" w:color="D9D9E0"/>
+              <w:left w:val="single" w:sz="6" w:color="D9D9E0"/>
+              <w:bottom w:val="single" w:sz="6" w:color="D9D9E0"/>
+              <w:right w:val="single" w:sz="6" w:color="D9D9E0"/>
+            </w:tcBorders>
+          </w:tcPr>
+          <w:p>
+            <w:pPr>
+              <w:spacing w:before="50" w:after="50"/>
+            </w:pPr>
+            <w:r>
+              <w:rPr>
+                <w:b w:val="0"/>
+              </w:rPr>
+              <w:t>Per-class n: median 3; 16 classes have fewer than 5 tickets, so per-class figures are indicative only</w:t>
+            </w:r>
+          </w:p>
+        </w:tc>
+        <w:tc>
+          <w:tcPr>
+            <w:tcW w:type="dxa" w:w="2160"/>
+            <w:tcBorders>
+              <w:top w:val="single" w:sz="6" w:color="D9D9E0"/>
+              <w:left w:val="single" w:sz="6" w:color="D9D9E0"/>
+              <w:bottom w:val="single" w:sz="6" w:color="D9D9E0"/>
+              <w:right w:val="single" w:sz="6" w:color="D9D9E0"/>
+            </w:tcBorders>
+          </w:tcPr>
+          <w:p>
+            <w:pPr>
+              <w:spacing w:before="50" w:after="50"/>
+            </w:pPr>
+            <w:r>
+              <w:rPr>
+                <w:b w:val="0"/>
+              </w:rPr>
+              <w:t>Weakest: account_access 0% (n=4); integration_help 0% (n=3); sso_configuration 33% (n=1). Overall intent accuracy 88.8%. The target is per class, so it is met only if every class reaches 85%.</w:t>
+            </w:r>
+          </w:p>
+        </w:tc>
+      </w:tr>
+      <w:tr>
+        <w:tc>
+          <w:tcPr>
+            <w:tcW w:type="dxa" w:w="2304"/>
+            <w:tcBorders>
+              <w:top w:val="single" w:sz="6" w:color="D9D9E0"/>
+              <w:left w:val="single" w:sz="6" w:color="D9D9E0"/>
+              <w:bottom w:val="single" w:sz="6" w:color="D9D9E0"/>
+              <w:right w:val="single" w:sz="6" w:color="D9D9E0"/>
+            </w:tcBorders>
+            <w:shd w:val="clear" w:fill="F4F4F7"/>
+          </w:tcPr>
+          <w:p>
+            <w:pPr>
+              <w:spacing w:before="50" w:after="50"/>
+            </w:pPr>
+            <w:r>
+              <w:rPr>
+                <w:sz w:val="15"/>
+              </w:rPr>
+              <w:t>Hallucination rate</w:t>
+            </w:r>
+          </w:p>
+        </w:tc>
+        <w:tc>
+          <w:tcPr>
+            <w:tcW w:type="dxa" w:w="1296"/>
+            <w:tcBorders>
+              <w:top w:val="single" w:sz="6" w:color="D9D9E0"/>
+              <w:left w:val="single" w:sz="6" w:color="D9D9E0"/>
+              <w:bottom w:val="single" w:sz="6" w:color="D9D9E0"/>
+              <w:right w:val="single" w:sz="6" w:color="D9D9E0"/>
+            </w:tcBorders>
+            <w:shd w:val="clear" w:fill="F4F4F7"/>
+          </w:tcPr>
+          <w:p>
+            <w:pPr>
+              <w:spacing w:before="50" w:after="50"/>
+            </w:pPr>
+            <w:r>
+              <w:rPr>
+                <w:sz w:val="15"/>
+              </w:rPr>
+              <w:t>—</w:t>
+            </w:r>
+          </w:p>
+        </w:tc>
+        <w:tc>
+          <w:tcPr>
+            <w:tcW w:type="dxa" w:w="1080"/>
+            <w:tcBorders>
+              <w:top w:val="single" w:sz="6" w:color="D9D9E0"/>
+              <w:left w:val="single" w:sz="6" w:color="D9D9E0"/>
+              <w:bottom w:val="single" w:sz="6" w:color="D9D9E0"/>
+              <w:right w:val="single" w:sz="6" w:color="D9D9E0"/>
+            </w:tcBorders>
+            <w:shd w:val="clear" w:fill="F4F4F7"/>
+          </w:tcPr>
+          <w:p>
+            <w:pPr>
+              <w:spacing w:before="50" w:after="50"/>
+            </w:pPr>
+            <w:r>
+              <w:rPr>
+                <w:sz w:val="15"/>
+              </w:rPr>
+              <w:t>≤ 5%</w:t>
+            </w:r>
+          </w:p>
+        </w:tc>
+        <w:tc>
+          <w:tcPr>
+            <w:tcW w:type="dxa" w:w="1080"/>
+            <w:tcBorders>
+              <w:top w:val="single" w:sz="6" w:color="D9D9E0"/>
+              <w:left w:val="single" w:sz="6" w:color="D9D9E0"/>
+              <w:bottom w:val="single" w:sz="6" w:color="D9D9E0"/>
+              <w:right w:val="single" w:sz="6" w:color="D9D9E0"/>
+            </w:tcBorders>
+            <w:shd w:val="clear" w:fill="F4F4F7"/>
+          </w:tcPr>
+          <w:p>
+            <w:pPr>
+              <w:spacing w:before="50" w:after="50"/>
+            </w:pPr>
+            <w:r>
+              <w:rPr>
+                <w:b/>
+              </w:rPr>
+              <w:t>Not measured to method — NOT MEASURED</w:t>
+            </w:r>
+          </w:p>
+        </w:tc>
+        <w:tc>
+          <w:tcPr>
+            <w:tcW w:type="dxa" w:w="1728"/>
+            <w:tcBorders>
+              <w:top w:val="single" w:sz="6" w:color="D9D9E0"/>
+              <w:left w:val="single" w:sz="6" w:color="D9D9E0"/>
+              <w:bottom w:val="single" w:sz="6" w:color="D9D9E0"/>
+              <w:right w:val="single" w:sz="6" w:color="D9D9E0"/>
+            </w:tcBorders>
+            <w:shd w:val="clear" w:fill="F4F4F7"/>
+          </w:tcPr>
+          <w:p>
+            <w:pPr>
+              <w:spacing w:before="50" w:after="50"/>
+            </w:pPr>
+            <w:r>
+              <w:rPr>
+                <w:b w:val="0"/>
+              </w:rPr>
+              <w:t>—</w:t>
+            </w:r>
+          </w:p>
+        </w:tc>
+        <w:tc>
+          <w:tcPr>
+            <w:tcW w:type="dxa" w:w="2160"/>
+            <w:tcBorders>
+              <w:top w:val="single" w:sz="6" w:color="D9D9E0"/>
+              <w:left w:val="single" w:sz="6" w:color="D9D9E0"/>
+              <w:bottom w:val="single" w:sz="6" w:color="D9D9E0"/>
+              <w:right w:val="single" w:sz="6" w:color="D9D9E0"/>
+            </w:tcBorders>
+            <w:shd w:val="clear" w:fill="F4F4F7"/>
+          </w:tcPr>
+          <w:p>
+            <w:pPr>
+              <w:spacing w:before="50" w:after="50"/>
+            </w:pPr>
+            <w:r>
+              <w:rPr>
+                <w:b w:val="0"/>
+              </w:rPr>
+              <w:t>The Framework requires at least fifty responses assessed independently by two people, with their agreement reported. This project had one human assessor. Nearest evidence (B-18, drafts from b21_openai_80_20260914): one human found an unsupported claim in 1 of 50 drafts; the LLM judge in 5 of 50; the judge failed calibration (pooled Spearman 0.3492 against 0.70).</w:t>
+            </w:r>
+          </w:p>
+        </w:tc>
+      </w:tr>
+      <w:tr>
+        <w:tc>
+          <w:tcPr>
+            <w:tcW w:type="dxa" w:w="2304"/>
+            <w:tcBorders>
+              <w:top w:val="single" w:sz="6" w:color="D9D9E0"/>
+              <w:left w:val="single" w:sz="6" w:color="D9D9E0"/>
+              <w:bottom w:val="single" w:sz="6" w:color="D9D9E0"/>
+              <w:right w:val="single" w:sz="6" w:color="D9D9E0"/>
+            </w:tcBorders>
+          </w:tcPr>
+          <w:p>
+            <w:pPr>
+              <w:spacing w:before="50" w:after="50"/>
+            </w:pPr>
+            <w:r>
+              <w:rPr>
+                <w:sz w:val="15"/>
+              </w:rPr>
+              <w:t>Citation accuracy</w:t>
+            </w:r>
+          </w:p>
+        </w:tc>
+        <w:tc>
+          <w:tcPr>
+            <w:tcW w:type="dxa" w:w="1296"/>
+            <w:tcBorders>
+              <w:top w:val="single" w:sz="6" w:color="D9D9E0"/>
+              <w:left w:val="single" w:sz="6" w:color="D9D9E0"/>
+              <w:bottom w:val="single" w:sz="6" w:color="D9D9E0"/>
+              <w:right w:val="single" w:sz="6" w:color="D9D9E0"/>
+            </w:tcBorders>
+          </w:tcPr>
+          <w:p>
+            <w:pPr>
+              <w:spacing w:before="50" w:after="50"/>
+            </w:pPr>
+            <w:r>
+              <w:rPr>
+                <w:sz w:val="15"/>
+              </w:rPr>
+              <w:t>—</w:t>
+            </w:r>
+          </w:p>
+        </w:tc>
+        <w:tc>
+          <w:tcPr>
+            <w:tcW w:type="dxa" w:w="1080"/>
+            <w:tcBorders>
+              <w:top w:val="single" w:sz="6" w:color="D9D9E0"/>
+              <w:left w:val="single" w:sz="6" w:color="D9D9E0"/>
+              <w:bottom w:val="single" w:sz="6" w:color="D9D9E0"/>
+              <w:right w:val="single" w:sz="6" w:color="D9D9E0"/>
+            </w:tcBorders>
+          </w:tcPr>
+          <w:p>
+            <w:pPr>
+              <w:spacing w:before="50" w:after="50"/>
+            </w:pPr>
+            <w:r>
+              <w:rPr>
+                <w:sz w:val="15"/>
+              </w:rPr>
+              <w:t>95%</w:t>
+            </w:r>
+          </w:p>
+        </w:tc>
+        <w:tc>
+          <w:tcPr>
+            <w:tcW w:type="dxa" w:w="1080"/>
+            <w:tcBorders>
+              <w:top w:val="single" w:sz="6" w:color="D9D9E0"/>
+              <w:left w:val="single" w:sz="6" w:color="D9D9E0"/>
+              <w:bottom w:val="single" w:sz="6" w:color="D9D9E0"/>
+              <w:right w:val="single" w:sz="6" w:color="D9D9E0"/>
+            </w:tcBorders>
+          </w:tcPr>
+          <w:p>
+            <w:pPr>
+              <w:spacing w:before="50" w:after="50"/>
+            </w:pPr>
+            <w:r>
+              <w:rPr>
+                <w:b/>
+              </w:rPr>
+              <w:t>Not measured to method — NOT MEASURED</w:t>
+            </w:r>
+          </w:p>
+        </w:tc>
+        <w:tc>
+          <w:tcPr>
+            <w:tcW w:type="dxa" w:w="1728"/>
+            <w:tcBorders>
+              <w:top w:val="single" w:sz="6" w:color="D9D9E0"/>
+              <w:left w:val="single" w:sz="6" w:color="D9D9E0"/>
+              <w:bottom w:val="single" w:sz="6" w:color="D9D9E0"/>
+              <w:right w:val="single" w:sz="6" w:color="D9D9E0"/>
+            </w:tcBorders>
+          </w:tcPr>
+          <w:p>
+            <w:pPr>
+              <w:spacing w:before="50" w:after="50"/>
+            </w:pPr>
+            <w:r>
+              <w:rPr>
+                <w:b w:val="0"/>
+              </w:rPr>
+              <w:t>—</w:t>
+            </w:r>
+          </w:p>
+        </w:tc>
+        <w:tc>
+          <w:tcPr>
+            <w:tcW w:type="dxa" w:w="2160"/>
+            <w:tcBorders>
+              <w:top w:val="single" w:sz="6" w:color="D9D9E0"/>
+              <w:left w:val="single" w:sz="6" w:color="D9D9E0"/>
+              <w:bottom w:val="single" w:sz="6" w:color="D9D9E0"/>
+              <w:right w:val="single" w:sz="6" w:color="D9D9E0"/>
+            </w:tcBorders>
+          </w:tcPr>
+          <w:p>
+            <w:pPr>
+              <w:spacing w:before="50" w:after="50"/>
+            </w:pPr>
+            <w:r>
+              <w:rPr>
+                <w:b w:val="0"/>
+              </w:rPr>
+              <w:t>The Framework checks each citation against the sentence it is attached to. Sentence-level support was not assessed. Nearest evidence: the cited ARTICLE was one the labels expect in 95.3% of citations over 53 drafts (recall 82.1%) — a check of the right source, not of support.</w:t>
+            </w:r>
+          </w:p>
+        </w:tc>
+      </w:tr>
+      <w:tr>
+        <w:tc>
+          <w:tcPr>
+            <w:tcW w:type="dxa" w:w="2304"/>
+            <w:tcBorders>
+              <w:top w:val="single" w:sz="6" w:color="D9D9E0"/>
+              <w:left w:val="single" w:sz="6" w:color="D9D9E0"/>
+              <w:bottom w:val="single" w:sz="6" w:color="D9D9E0"/>
+              <w:right w:val="single" w:sz="6" w:color="D9D9E0"/>
+            </w:tcBorders>
+            <w:shd w:val="clear" w:fill="F4F4F7"/>
+          </w:tcPr>
+          <w:p>
+            <w:pPr>
+              <w:spacing w:before="50" w:after="50"/>
+            </w:pPr>
+            <w:r>
+              <w:rPr>
+                <w:sz w:val="15"/>
+              </w:rPr>
+              <w:t>Latency p95</w:t>
+            </w:r>
+          </w:p>
+        </w:tc>
+        <w:tc>
+          <w:tcPr>
+            <w:tcW w:type="dxa" w:w="1296"/>
+            <w:tcBorders>
+              <w:top w:val="single" w:sz="6" w:color="D9D9E0"/>
+              <w:left w:val="single" w:sz="6" w:color="D9D9E0"/>
+              <w:bottom w:val="single" w:sz="6" w:color="D9D9E0"/>
+              <w:right w:val="single" w:sz="6" w:color="D9D9E0"/>
+            </w:tcBorders>
+            <w:shd w:val="clear" w:fill="F4F4F7"/>
+          </w:tcPr>
+          <w:p>
+            <w:pPr>
+              <w:spacing w:before="50" w:after="50"/>
+            </w:pPr>
+            <w:r>
+              <w:rPr>
+                <w:sz w:val="15"/>
+              </w:rPr>
+              <w:t>—</w:t>
+            </w:r>
+          </w:p>
+        </w:tc>
+        <w:tc>
+          <w:tcPr>
+            <w:tcW w:type="dxa" w:w="1080"/>
+            <w:tcBorders>
+              <w:top w:val="single" w:sz="6" w:color="D9D9E0"/>
+              <w:left w:val="single" w:sz="6" w:color="D9D9E0"/>
+              <w:bottom w:val="single" w:sz="6" w:color="D9D9E0"/>
+              <w:right w:val="single" w:sz="6" w:color="D9D9E0"/>
+            </w:tcBorders>
+            <w:shd w:val="clear" w:fill="F4F4F7"/>
+          </w:tcPr>
+          <w:p>
+            <w:pPr>
+              <w:spacing w:before="50" w:after="50"/>
+            </w:pPr>
+            <w:r>
+              <w:rPr>
+                <w:sz w:val="15"/>
+              </w:rPr>
+              <w:t>&lt; 3 s</w:t>
+            </w:r>
+          </w:p>
+        </w:tc>
+        <w:tc>
+          <w:tcPr>
+            <w:tcW w:type="dxa" w:w="1080"/>
+            <w:tcBorders>
+              <w:top w:val="single" w:sz="6" w:color="D9D9E0"/>
+              <w:left w:val="single" w:sz="6" w:color="D9D9E0"/>
+              <w:bottom w:val="single" w:sz="6" w:color="D9D9E0"/>
+              <w:right w:val="single" w:sz="6" w:color="D9D9E0"/>
+            </w:tcBorders>
+            <w:shd w:val="clear" w:fill="F4F4F7"/>
+          </w:tcPr>
+          <w:p>
+            <w:pPr>
+              <w:spacing w:before="50" w:after="50"/>
+            </w:pPr>
+            <w:r>
+              <w:rPr>
+                <w:b/>
+              </w:rPr>
+              <w:t>6.7 s — NOT MET</w:t>
+            </w:r>
+          </w:p>
+        </w:tc>
+        <w:tc>
+          <w:tcPr>
+            <w:tcW w:type="dxa" w:w="1728"/>
+            <w:tcBorders>
+              <w:top w:val="single" w:sz="6" w:color="D9D9E0"/>
+              <w:left w:val="single" w:sz="6" w:color="D9D9E0"/>
+              <w:bottom w:val="single" w:sz="6" w:color="D9D9E0"/>
+              <w:right w:val="single" w:sz="6" w:color="D9D9E0"/>
+            </w:tcBorders>
+            <w:shd w:val="clear" w:fill="F4F4F7"/>
+          </w:tcPr>
+          <w:p>
+            <w:pPr>
+              <w:spacing w:before="50" w:after="50"/>
+            </w:pPr>
+            <w:r>
+              <w:rPr>
+                <w:b w:val="0"/>
+              </w:rPr>
+              <w:t>n=71 live tickets; max 7.0 s; 9 cache-replayed tickets excluded</w:t>
+            </w:r>
+          </w:p>
+        </w:tc>
+        <w:tc>
+          <w:tcPr>
+            <w:tcW w:type="dxa" w:w="2160"/>
+            <w:tcBorders>
+              <w:top w:val="single" w:sz="6" w:color="D9D9E0"/>
+              <w:left w:val="single" w:sz="6" w:color="D9D9E0"/>
+              <w:bottom w:val="single" w:sz="6" w:color="D9D9E0"/>
+              <w:right w:val="single" w:sz="6" w:color="D9D9E0"/>
+            </w:tcBorders>
+            <w:shd w:val="clear" w:fill="F4F4F7"/>
+          </w:tcPr>
+          <w:p>
+            <w:pPr>
+              <w:spacing w:before="50" w:after="50"/>
+            </w:pPr>
+            <w:r>
+              <w:rPr>
+                <w:b w:val="0"/>
+              </w:rPr>
+              <w:t>End to end per ticket, including retrieval and every model call, run in sequence. Models: gpt-4o-mini drafting, gpt-4o guardrails.</w:t>
+            </w:r>
+          </w:p>
+        </w:tc>
+      </w:tr>
+      <w:tr>
+        <w:tc>
+          <w:tcPr>
+            <w:tcW w:type="dxa" w:w="2304"/>
+            <w:tcBorders>
+              <w:top w:val="single" w:sz="6" w:color="D9D9E0"/>
+              <w:left w:val="single" w:sz="6" w:color="D9D9E0"/>
+              <w:bottom w:val="single" w:sz="6" w:color="D9D9E0"/>
+              <w:right w:val="single" w:sz="6" w:color="D9D9E0"/>
+            </w:tcBorders>
+          </w:tcPr>
+          <w:p>
+            <w:pPr>
+              <w:spacing w:before="50" w:after="50"/>
+            </w:pPr>
+            <w:r>
+              <w:rPr>
+                <w:sz w:val="15"/>
+              </w:rPr>
+              <w:t>Private data occurrences</w:t>
+            </w:r>
+          </w:p>
+        </w:tc>
+        <w:tc>
+          <w:tcPr>
+            <w:tcW w:type="dxa" w:w="1296"/>
+            <w:tcBorders>
+              <w:top w:val="single" w:sz="6" w:color="D9D9E0"/>
+              <w:left w:val="single" w:sz="6" w:color="D9D9E0"/>
+              <w:bottom w:val="single" w:sz="6" w:color="D9D9E0"/>
+              <w:right w:val="single" w:sz="6" w:color="D9D9E0"/>
+            </w:tcBorders>
+          </w:tcPr>
+          <w:p>
+            <w:pPr>
+              <w:spacing w:before="50" w:after="50"/>
+            </w:pPr>
+            <w:r>
+              <w:rPr>
+                <w:sz w:val="15"/>
+              </w:rPr>
+              <w:t>—</w:t>
+            </w:r>
+          </w:p>
+        </w:tc>
+        <w:tc>
+          <w:tcPr>
+            <w:tcW w:type="dxa" w:w="1080"/>
+            <w:tcBorders>
+              <w:top w:val="single" w:sz="6" w:color="D9D9E0"/>
+              <w:left w:val="single" w:sz="6" w:color="D9D9E0"/>
+              <w:bottom w:val="single" w:sz="6" w:color="D9D9E0"/>
+              <w:right w:val="single" w:sz="6" w:color="D9D9E0"/>
+            </w:tcBorders>
+          </w:tcPr>
+          <w:p>
+            <w:pPr>
+              <w:spacing w:before="50" w:after="50"/>
+            </w:pPr>
+            <w:r>
+              <w:rPr>
+                <w:sz w:val="15"/>
+              </w:rPr>
+              <w:t>0</w:t>
+            </w:r>
+          </w:p>
+        </w:tc>
+        <w:tc>
+          <w:tcPr>
+            <w:tcW w:type="dxa" w:w="1080"/>
+            <w:tcBorders>
+              <w:top w:val="single" w:sz="6" w:color="D9D9E0"/>
+              <w:left w:val="single" w:sz="6" w:color="D9D9E0"/>
+              <w:bottom w:val="single" w:sz="6" w:color="D9D9E0"/>
+              <w:right w:val="single" w:sz="6" w:color="D9D9E0"/>
+            </w:tcBorders>
+          </w:tcPr>
+          <w:p>
+            <w:pPr>
+              <w:spacing w:before="50" w:after="50"/>
+            </w:pPr>
+            <w:r>
+              <w:rPr>
+                <w:b w:val="0"/>
+              </w:rPr>
+              <w:t>0 — MET</w:t>
+            </w:r>
+          </w:p>
+        </w:tc>
+        <w:tc>
+          <w:tcPr>
+            <w:tcW w:type="dxa" w:w="1728"/>
+            <w:tcBorders>
+              <w:top w:val="single" w:sz="6" w:color="D9D9E0"/>
+              <w:left w:val="single" w:sz="6" w:color="D9D9E0"/>
+              <w:bottom w:val="single" w:sz="6" w:color="D9D9E0"/>
+              <w:right w:val="single" w:sz="6" w:color="D9D9E0"/>
+            </w:tcBorders>
+          </w:tcPr>
+          <w:p>
+            <w:pPr>
+              <w:spacing w:before="50" w:after="50"/>
+            </w:pPr>
+            <w:r>
+              <w:rPr>
+                <w:b w:val="0"/>
+              </w:rPr>
+              <w:t>Automated scan of all 48 sent replies; manual sample review: not done</w:t>
+            </w:r>
+          </w:p>
+        </w:tc>
+        <w:tc>
+          <w:tcPr>
+            <w:tcW w:type="dxa" w:w="2160"/>
+            <w:tcBorders>
+              <w:top w:val="single" w:sz="6" w:color="D9D9E0"/>
+              <w:left w:val="single" w:sz="6" w:color="D9D9E0"/>
+              <w:bottom w:val="single" w:sz="6" w:color="D9D9E0"/>
+              <w:right w:val="single" w:sz="6" w:color="D9D9E0"/>
+            </w:tcBorders>
+          </w:tcPr>
+          <w:p>
+            <w:pPr>
+              <w:spacing w:before="50" w:after="50"/>
+            </w:pPr>
+            <w:r>
+              <w:rPr>
+                <w:b w:val="0"/>
+              </w:rPr>
+              <w:t>The scan uses the PII guardrail's own patterns (email, API key, phone, account number), independently of the judge's verdict. The guardrail blocked 0 drafts for private data before sending.</w:t>
+            </w:r>
+          </w:p>
+        </w:tc>
+      </w:tr>
+      <w:tr>
+        <w:tc>
+          <w:tcPr>
+            <w:tcW w:type="dxa" w:w="2304"/>
+            <w:tcBorders>
+              <w:top w:val="single" w:sz="6" w:color="D9D9E0"/>
+              <w:left w:val="single" w:sz="6" w:color="D9D9E0"/>
+              <w:bottom w:val="single" w:sz="6" w:color="D9D9E0"/>
+              <w:right w:val="single" w:sz="6" w:color="D9D9E0"/>
+            </w:tcBorders>
+            <w:shd w:val="clear" w:fill="F4F4F7"/>
+          </w:tcPr>
+          <w:p>
+            <w:pPr>
+              <w:spacing w:before="50" w:after="50"/>
+            </w:pPr>
+            <w:r>
+              <w:rPr>
+                <w:sz w:val="15"/>
+              </w:rPr>
+              <w:t>Cross-group variation</w:t>
+            </w:r>
+          </w:p>
+        </w:tc>
+        <w:tc>
+          <w:tcPr>
+            <w:tcW w:type="dxa" w:w="1296"/>
+            <w:tcBorders>
+              <w:top w:val="single" w:sz="6" w:color="D9D9E0"/>
+              <w:left w:val="single" w:sz="6" w:color="D9D9E0"/>
+              <w:bottom w:val="single" w:sz="6" w:color="D9D9E0"/>
+              <w:right w:val="single" w:sz="6" w:color="D9D9E0"/>
+            </w:tcBorders>
+            <w:shd w:val="clear" w:fill="F4F4F7"/>
+          </w:tcPr>
+          <w:p>
+            <w:pPr>
+              <w:spacing w:before="50" w:after="50"/>
+            </w:pPr>
+            <w:r>
+              <w:rPr>
+                <w:sz w:val="15"/>
+              </w:rPr>
+              <w:t>—</w:t>
+            </w:r>
+          </w:p>
+        </w:tc>
+        <w:tc>
+          <w:tcPr>
+            <w:tcW w:type="dxa" w:w="1080"/>
+            <w:tcBorders>
+              <w:top w:val="single" w:sz="6" w:color="D9D9E0"/>
+              <w:left w:val="single" w:sz="6" w:color="D9D9E0"/>
+              <w:bottom w:val="single" w:sz="6" w:color="D9D9E0"/>
+              <w:right w:val="single" w:sz="6" w:color="D9D9E0"/>
+            </w:tcBorders>
+            <w:shd w:val="clear" w:fill="F4F4F7"/>
+          </w:tcPr>
+          <w:p>
+            <w:pPr>
+              <w:spacing w:before="50" w:after="50"/>
+            </w:pPr>
+            <w:r>
+              <w:rPr>
+                <w:sz w:val="15"/>
+              </w:rPr>
+              <w:t>&lt; 5 pts</w:t>
+            </w:r>
+          </w:p>
+        </w:tc>
+        <w:tc>
+          <w:tcPr>
+            <w:tcW w:type="dxa" w:w="1080"/>
+            <w:tcBorders>
+              <w:top w:val="single" w:sz="6" w:color="D9D9E0"/>
+              <w:left w:val="single" w:sz="6" w:color="D9D9E0"/>
+              <w:bottom w:val="single" w:sz="6" w:color="D9D9E0"/>
+              <w:right w:val="single" w:sz="6" w:color="D9D9E0"/>
+            </w:tcBorders>
+            <w:shd w:val="clear" w:fill="F4F4F7"/>
+          </w:tcPr>
+          <w:p>
+            <w:pPr>
+              <w:spacing w:before="50" w:after="50"/>
+            </w:pPr>
+            <w:r>
+              <w:rPr>
+                <w:b/>
+              </w:rPr>
+              <w:t>20 pts (language_fluency: non_fluent vs fluent) — NOT MET</w:t>
+            </w:r>
+          </w:p>
+        </w:tc>
+        <w:tc>
+          <w:tcPr>
+            <w:tcW w:type="dxa" w:w="1728"/>
+            <w:tcBorders>
+              <w:top w:val="single" w:sz="6" w:color="D9D9E0"/>
+              <w:left w:val="single" w:sz="6" w:color="D9D9E0"/>
+              <w:bottom w:val="single" w:sz="6" w:color="D9D9E0"/>
+              <w:right w:val="single" w:sz="6" w:color="D9D9E0"/>
+            </w:tcBorders>
+            <w:shd w:val="clear" w:fill="F4F4F7"/>
+          </w:tcPr>
+          <w:p>
+            <w:pPr>
+              <w:spacing w:before="50" w:after="50"/>
+            </w:pPr>
+            <w:r>
+              <w:rPr>
+                <w:b w:val="0"/>
+              </w:rPr>
+              <w:t>breach not significant at n=19; segments under n=10 excluded</w:t>
+            </w:r>
+          </w:p>
+        </w:tc>
+        <w:tc>
+          <w:tcPr>
+            <w:tcW w:type="dxa" w:w="2160"/>
+            <w:tcBorders>
+              <w:top w:val="single" w:sz="6" w:color="D9D9E0"/>
+              <w:left w:val="single" w:sz="6" w:color="D9D9E0"/>
+              <w:bottom w:val="single" w:sz="6" w:color="D9D9E0"/>
+              <w:right w:val="single" w:sz="6" w:color="D9D9E0"/>
+            </w:tcBorders>
+            <w:shd w:val="clear" w:fill="F4F4F7"/>
+          </w:tcPr>
+          <w:p>
+            <w:pPr>
+              <w:spacing w:before="50" w:after="50"/>
+            </w:pPr>
+            <w:r>
+              <w:rPr>
+                <w:b w:val="0"/>
+              </w:rPr>
+              <w:t>Quality here is decision correctness against labels, not a rubric score, across language fluency, region and tier. NFR-05 allows 15 points; this Framework target is 5. Full per-segment figures: fairness audit.</w:t>
+            </w:r>
+          </w:p>
+        </w:tc>
+      </w:tr>
+    </w:tbl>
+    <w:p>
+      <w:pPr>
+        <w:pStyle w:val="Heading3"/>
+      </w:pPr>
+      <w:r>
+        <w:t>Governance conditions on the same run (tier three)</w:t>
+      </w:r>
+    </w:p>
+    <w:tbl>
+      <w:tblPr>
+        <w:tblW w:type="auto" w:w="0"/>
+        <w:jc w:val="center"/>
+        <w:tblLayout w:type="fixed"/>
+        <w:tblLook w:firstColumn="1" w:firstRow="1" w:lastColumn="0" w:lastRow="0" w:noHBand="0" w:noVBand="1" w:val="04A0"/>
+      </w:tblPr>
+      <w:tblGrid>
+        <w:gridCol w:w="3216"/>
+        <w:gridCol w:w="3216"/>
+        <w:gridCol w:w="3216"/>
+      </w:tblGrid>
+      <w:tr>
+        <w:tc>
+          <w:tcPr>
+            <w:tcW w:type="dxa" w:w="2160"/>
+            <w:shd w:val="clear" w:fill="1A1A2E"/>
+            <w:tcBorders>
+              <w:top w:val="single" w:sz="6" w:color="D9D9E0"/>
+              <w:left w:val="single" w:sz="6" w:color="D9D9E0"/>
+              <w:bottom w:val="single" w:sz="6" w:color="D9D9E0"/>
+              <w:right w:val="single" w:sz="6" w:color="D9D9E0"/>
+            </w:tcBorders>
+          </w:tcPr>
+          <w:p>
+            <w:pPr>
+              <w:spacing w:before="60" w:after="60"/>
+            </w:pPr>
+            <w:r>
+              <w:rPr>
+                <w:b/>
+                <w:color w:val="FFFFFF"/>
+                <w:sz w:val="18"/>
+              </w:rPr>
+              <w:t>Condition</w:t>
+            </w:r>
+          </w:p>
+        </w:tc>
+        <w:tc>
+          <w:tcPr>
+            <w:tcW w:type="dxa" w:w="2448"/>
+            <w:shd w:val="clear" w:fill="1A1A2E"/>
+            <w:tcBorders>
+              <w:top w:val="single" w:sz="6" w:color="D9D9E0"/>
+              <w:left w:val="single" w:sz="6" w:color="D9D9E0"/>
+              <w:bottom w:val="single" w:sz="6" w:color="D9D9E0"/>
+              <w:right w:val="single" w:sz="6" w:color="D9D9E0"/>
+            </w:tcBorders>
+          </w:tcPr>
+          <w:p>
+            <w:pPr>
+              <w:spacing w:before="60" w:after="60"/>
+            </w:pPr>
+            <w:r>
+              <w:rPr>
+                <w:b/>
+                <w:color w:val="FFFFFF"/>
+                <w:sz w:val="18"/>
+              </w:rPr>
+              <w:t>Requirement</w:t>
+            </w:r>
+          </w:p>
+        </w:tc>
+        <w:tc>
+          <w:tcPr>
+            <w:tcW w:type="dxa" w:w="5040"/>
+            <w:shd w:val="clear" w:fill="1A1A2E"/>
+            <w:tcBorders>
+              <w:top w:val="single" w:sz="6" w:color="D9D9E0"/>
+              <w:left w:val="single" w:sz="6" w:color="D9D9E0"/>
+              <w:bottom w:val="single" w:sz="6" w:color="D9D9E0"/>
+              <w:right w:val="single" w:sz="6" w:color="D9D9E0"/>
+            </w:tcBorders>
+          </w:tcPr>
+          <w:p>
+            <w:pPr>
+              <w:spacing w:before="60" w:after="60"/>
+            </w:pPr>
+            <w:r>
+              <w:rPr>
+                <w:b/>
+                <w:color w:val="FFFFFF"/>
+                <w:sz w:val="18"/>
+              </w:rPr>
+              <w:t>Result</w:t>
+            </w:r>
+          </w:p>
+        </w:tc>
+      </w:tr>
+      <w:tr>
+        <w:tc>
+          <w:tcPr>
+            <w:tcW w:type="dxa" w:w="2160"/>
+            <w:tcBorders>
+              <w:top w:val="single" w:sz="6" w:color="D9D9E0"/>
+              <w:left w:val="single" w:sz="6" w:color="D9D9E0"/>
+              <w:bottom w:val="single" w:sz="6" w:color="D9D9E0"/>
+              <w:right w:val="single" w:sz="6" w:color="D9D9E0"/>
+            </w:tcBorders>
+          </w:tcPr>
+          <w:p>
+            <w:pPr>
+              <w:spacing w:before="50" w:after="50"/>
+            </w:pPr>
+            <w:r>
+              <w:rPr>
+                <w:sz w:val="17"/>
+              </w:rPr>
+              <w:t>Private data in outbound text</w:t>
+            </w:r>
+          </w:p>
+        </w:tc>
+        <w:tc>
+          <w:tcPr>
+            <w:tcW w:type="dxa" w:w="2448"/>
+            <w:tcBorders>
+              <w:top w:val="single" w:sz="6" w:color="D9D9E0"/>
+              <w:left w:val="single" w:sz="6" w:color="D9D9E0"/>
+              <w:bottom w:val="single" w:sz="6" w:color="D9D9E0"/>
+              <w:right w:val="single" w:sz="6" w:color="D9D9E0"/>
+            </w:tcBorders>
+          </w:tcPr>
+          <w:p>
+            <w:pPr>
+              <w:spacing w:before="50" w:after="50"/>
+            </w:pPr>
+            <w:r>
+              <w:rPr>
+                <w:sz w:val="17"/>
+              </w:rPr>
+              <w:t>Zero occurrences.</w:t>
+            </w:r>
+          </w:p>
+        </w:tc>
+        <w:tc>
+          <w:tcPr>
+            <w:tcW w:type="dxa" w:w="5040"/>
+            <w:tcBorders>
+              <w:top w:val="single" w:sz="6" w:color="D9D9E0"/>
+              <w:left w:val="single" w:sz="6" w:color="D9D9E0"/>
+              <w:bottom w:val="single" w:sz="6" w:color="D9D9E0"/>
+              <w:right w:val="single" w:sz="6" w:color="D9D9E0"/>
+            </w:tcBorders>
+          </w:tcPr>
+          <w:p>
+            <w:pPr>
+              <w:spacing w:before="50" w:after="50"/>
+            </w:pPr>
+            <w:r>
+              <w:rPr>
+                <w:sz w:val="17"/>
+              </w:rPr>
+              <w:t>0 (Automated scan of all 48 sent replies; manual sample review: not done) — MET</w:t>
+            </w:r>
+          </w:p>
+        </w:tc>
+      </w:tr>
+      <w:tr>
+        <w:tc>
+          <w:tcPr>
+            <w:tcW w:type="dxa" w:w="2160"/>
+            <w:tcBorders>
+              <w:top w:val="single" w:sz="6" w:color="D9D9E0"/>
+              <w:left w:val="single" w:sz="6" w:color="D9D9E0"/>
+              <w:bottom w:val="single" w:sz="6" w:color="D9D9E0"/>
+              <w:right w:val="single" w:sz="6" w:color="D9D9E0"/>
+            </w:tcBorders>
+            <w:shd w:val="clear" w:fill="F4F4F7"/>
+          </w:tcPr>
+          <w:p>
+            <w:pPr>
+              <w:spacing w:before="50" w:after="50"/>
+            </w:pPr>
+            <w:r>
+              <w:rPr>
+                <w:sz w:val="17"/>
+              </w:rPr>
+              <w:t>Quality across customer groups</w:t>
+            </w:r>
+          </w:p>
+        </w:tc>
+        <w:tc>
+          <w:tcPr>
+            <w:tcW w:type="dxa" w:w="2448"/>
+            <w:tcBorders>
+              <w:top w:val="single" w:sz="6" w:color="D9D9E0"/>
+              <w:left w:val="single" w:sz="6" w:color="D9D9E0"/>
+              <w:bottom w:val="single" w:sz="6" w:color="D9D9E0"/>
+              <w:right w:val="single" w:sz="6" w:color="D9D9E0"/>
+            </w:tcBorders>
+            <w:shd w:val="clear" w:fill="F4F4F7"/>
+          </w:tcPr>
+          <w:p>
+            <w:pPr>
+              <w:spacing w:before="50" w:after="50"/>
+            </w:pPr>
+            <w:r>
+              <w:rPr>
+                <w:sz w:val="17"/>
+              </w:rPr>
+              <w:t>Under five percentage points of variation.</w:t>
+            </w:r>
+          </w:p>
+        </w:tc>
+        <w:tc>
+          <w:tcPr>
+            <w:tcW w:type="dxa" w:w="5040"/>
+            <w:tcBorders>
+              <w:top w:val="single" w:sz="6" w:color="D9D9E0"/>
+              <w:left w:val="single" w:sz="6" w:color="D9D9E0"/>
+              <w:bottom w:val="single" w:sz="6" w:color="D9D9E0"/>
+              <w:right w:val="single" w:sz="6" w:color="D9D9E0"/>
+            </w:tcBorders>
+            <w:shd w:val="clear" w:fill="F4F4F7"/>
+          </w:tcPr>
+          <w:p>
+            <w:pPr>
+              <w:spacing w:before="50" w:after="50"/>
+            </w:pPr>
+            <w:r>
+              <w:rPr>
+                <w:sz w:val="17"/>
+              </w:rPr>
+              <w:t>20 pts (language_fluency: non_fluent vs fluent) (breach not significant at n=19; segments under n=10 excluded) — NOT MET</w:t>
+            </w:r>
+          </w:p>
+        </w:tc>
+      </w:tr>
+      <w:tr>
+        <w:tc>
+          <w:tcPr>
+            <w:tcW w:type="dxa" w:w="2160"/>
+            <w:tcBorders>
+              <w:top w:val="single" w:sz="6" w:color="D9D9E0"/>
+              <w:left w:val="single" w:sz="6" w:color="D9D9E0"/>
+              <w:bottom w:val="single" w:sz="6" w:color="D9D9E0"/>
+              <w:right w:val="single" w:sz="6" w:color="D9D9E0"/>
+            </w:tcBorders>
+          </w:tcPr>
+          <w:p>
+            <w:pPr>
+              <w:spacing w:before="50" w:after="50"/>
+            </w:pPr>
+            <w:r>
+              <w:rPr>
+                <w:sz w:val="17"/>
+              </w:rPr>
+              <w:t>Decision logging</w:t>
+            </w:r>
+          </w:p>
+        </w:tc>
+        <w:tc>
+          <w:tcPr>
+            <w:tcW w:type="dxa" w:w="2448"/>
+            <w:tcBorders>
+              <w:top w:val="single" w:sz="6" w:color="D9D9E0"/>
+              <w:left w:val="single" w:sz="6" w:color="D9D9E0"/>
+              <w:bottom w:val="single" w:sz="6" w:color="D9D9E0"/>
+              <w:right w:val="single" w:sz="6" w:color="D9D9E0"/>
+            </w:tcBorders>
+          </w:tcPr>
+          <w:p>
+            <w:pPr>
+              <w:spacing w:before="50" w:after="50"/>
+            </w:pPr>
+            <w:r>
+              <w:rPr>
+                <w:sz w:val="17"/>
+              </w:rPr>
+              <w:t>Complete coverage.</w:t>
+            </w:r>
+          </w:p>
+        </w:tc>
+        <w:tc>
+          <w:tcPr>
+            <w:tcW w:type="dxa" w:w="5040"/>
+            <w:tcBorders>
+              <w:top w:val="single" w:sz="6" w:color="D9D9E0"/>
+              <w:left w:val="single" w:sz="6" w:color="D9D9E0"/>
+              <w:bottom w:val="single" w:sz="6" w:color="D9D9E0"/>
+              <w:right w:val="single" w:sz="6" w:color="D9D9E0"/>
+            </w:tcBorders>
+          </w:tcPr>
+          <w:p>
+            <w:pPr>
+              <w:spacing w:before="50" w:after="50"/>
+            </w:pPr>
+            <w:r>
+              <w:rPr>
+                <w:sz w:val="17"/>
+              </w:rPr>
+              <w:t>80 of 80 tickets logged; reconciles=True — MET</w:t>
+            </w:r>
+          </w:p>
+        </w:tc>
+      </w:tr>
+      <w:tr>
+        <w:tc>
+          <w:tcPr>
+            <w:tcW w:type="dxa" w:w="2160"/>
+            <w:tcBorders>
+              <w:top w:val="single" w:sz="6" w:color="D9D9E0"/>
+              <w:left w:val="single" w:sz="6" w:color="D9D9E0"/>
+              <w:bottom w:val="single" w:sz="6" w:color="D9D9E0"/>
+              <w:right w:val="single" w:sz="6" w:color="D9D9E0"/>
+            </w:tcBorders>
+            <w:shd w:val="clear" w:fill="F4F4F7"/>
+          </w:tcPr>
+          <w:p>
+            <w:pPr>
+              <w:spacing w:before="50" w:after="50"/>
+            </w:pPr>
+            <w:r>
+              <w:rPr>
+                <w:sz w:val="17"/>
+              </w:rPr>
+              <w:t>Confidence calibration</w:t>
+            </w:r>
+          </w:p>
+        </w:tc>
+        <w:tc>
+          <w:tcPr>
+            <w:tcW w:type="dxa" w:w="2448"/>
+            <w:tcBorders>
+              <w:top w:val="single" w:sz="6" w:color="D9D9E0"/>
+              <w:left w:val="single" w:sz="6" w:color="D9D9E0"/>
+              <w:bottom w:val="single" w:sz="6" w:color="D9D9E0"/>
+              <w:right w:val="single" w:sz="6" w:color="D9D9E0"/>
+            </w:tcBorders>
+            <w:shd w:val="clear" w:fill="F4F4F7"/>
+          </w:tcPr>
+          <w:p>
+            <w:pPr>
+              <w:spacing w:before="50" w:after="50"/>
+            </w:pPr>
+            <w:r>
+              <w:rPr>
+                <w:sz w:val="17"/>
+              </w:rPr>
+              <w:t>Stated confidence within five points of observed accuracy.</w:t>
+            </w:r>
+          </w:p>
+        </w:tc>
+        <w:tc>
+          <w:tcPr>
+            <w:tcW w:type="dxa" w:w="5040"/>
+            <w:tcBorders>
+              <w:top w:val="single" w:sz="6" w:color="D9D9E0"/>
+              <w:left w:val="single" w:sz="6" w:color="D9D9E0"/>
+              <w:bottom w:val="single" w:sz="6" w:color="D9D9E0"/>
+              <w:right w:val="single" w:sz="6" w:color="D9D9E0"/>
+            </w:tcBorders>
+            <w:shd w:val="clear" w:fill="F4F4F7"/>
+          </w:tcPr>
+          <w:p>
+            <w:pPr>
+              <w:spacing w:before="50" w:after="50"/>
+            </w:pPr>
+            <w:r>
+              <w:rPr>
+                <w:sz w:val="17"/>
+              </w:rPr>
+              <w:t>largest gap -35.0 pts in band 0.7-0.8 (stated 0.75, observed 0.40, n=10); 0.80-0.90 band observed 0.94 (n=53, Framework expects about 0.85) — NOT MET</w:t>
             </w:r>
           </w:p>
         </w:tc>

</xml_diff>

<commit_message>
evidence: stamp the final results with the code that produced them
The two final runs (final_val_paid_80_20260927, final_dev_local_50_20260927)
started at 15:45 on 27 Sep; every code change in 47e0bc1 was made before
that (latest 15:16), so the runs used exactly that code. Regenerated from the
stored rows with no model calls:

- both results_table.md/.json: code version 47e0bc1 in place of
  "a288388 + uncommitted changes"; no figure changed
- Evaluation_Framework.docx: the two results sections refreshed
- AlokKulkarni_Capstone_Report.pdf: rebuilt, cover and appendix show 47e0bc1

Co-Authored-By: Claude Opus 5.5 <noreply@anthropic.com>
</commit_message>
<xml_diff>
--- a/docs/Evaluation_Framework.docx
+++ b/docs/Evaluation_Framework.docx
@@ -4243,7 +4243,7 @@
           <w:color w:val="4A4A63"/>
           <w:sz w:val="21"/>
         </w:rPr>
-        <w:t>Run harness-20260927T101501Z-10995e3f (2026-09-27 UTC), 80 tickets, code a288388 + uncommitted changes. Drafting gpt-4o-mini; guardrails gpt-4o. Confidence threshold 0.85; guardrails on; model cache off (304 live calls, 0 replayed). Runs against the hidden evaluation set: 0. Cost of the run: $0.9130 (650,349 tokens in, 25,828 out). Figures generated by evaluation/results_table.py from evaluation/results/final_val_paid_80_20260927.</w:t>
+        <w:t>Run harness-20260927T101501Z-10995e3f (2026-09-27 UTC), 80 tickets, code 47e0bc1. Drafting gpt-4o-mini; guardrails gpt-4o. Confidence threshold 0.85; guardrails on; model cache off (304 live calls, 0 replayed). Runs against the hidden evaluation set: 0. Cost of the run: $0.9130 (650,349 tokens in, 25,828 out). Figures generated by evaluation/results_table.py from evaluation/results/final_val_paid_80_20260927.</w:t>
       </w:r>
     </w:p>
     <w:tbl>
@@ -6464,7 +6464,7 @@
           <w:color w:val="4A4A63"/>
           <w:sz w:val="21"/>
         </w:rPr>
-        <w:t>Run harness-20260927T101501Z-32ab3564 (2026-09-27 UTC), 50 tickets, code a288388 + uncommitted changes. Drafting llama3.1-8b-ctx8k; guardrails qwen2.5-7b-ctx8k. Confidence threshold 0.85; guardrails on; model cache off (198 live calls, 0 replayed). Runs against the hidden evaluation set: 0. Cost of the run: $0.0000 (429,130 tokens in, 16,449 out). Figures generated by evaluation/results_table.py from evaluation/results/final_dev_local_50_20260927.</w:t>
+        <w:t>Run harness-20260927T101501Z-32ab3564 (2026-09-27 UTC), 50 tickets, code 47e0bc1. Drafting llama3.1-8b-ctx8k; guardrails qwen2.5-7b-ctx8k. Confidence threshold 0.85; guardrails on; model cache off (198 live calls, 0 replayed). Runs against the hidden evaluation set: 0. Cost of the run: $0.0000 (429,130 tokens in, 16,449 out). Figures generated by evaluation/results_table.py from evaluation/results/final_dev_local_50_20260927.</w:t>
       </w:r>
     </w:p>
     <w:tbl>

</xml_diff>